<commit_message>
docs(gameplay): synchronize operating plans and record restored-account b53 validation
</commit_message>
<xml_diff>
--- a/AI/planning/beta-20260913/정리본/왕국군_키우기_사업소개서.docx
+++ b/AI/planning/beta-20260913/정리본/왕국군_키우기_사업소개서.docx
@@ -124,34 +124,7 @@
     </w:p>
     <w:p>
       <w:r>
-        <w:rPr>
-          <w:b w:val="0"/>
-        </w:rPr>
-        <w:t xml:space="preserve">판매 검증의 중심은 </w:t>
-      </w:r>
-      <w:r>
-        <w:rPr>
-          <w:b/>
-        </w:rPr>
-        <w:t>30일 시즌 패스와 일회성 성장 펀드</w:t>
-      </w:r>
-      <w:r>
-        <w:rPr>
-          <w:b w:val="0"/>
-        </w:rPr>
-        <w:t xml:space="preserve">다. 무료 진행을 바탕으로 확정 보상과 성장 선택의 가치를 판매한다. 첫 제작 범위는 </w:t>
-      </w:r>
-      <w:r>
-        <w:rPr>
-          <w:b/>
-        </w:rPr>
-        <w:t>3스테이지 33웨이브</w:t>
-      </w:r>
-      <w:r>
-        <w:rPr>
-          <w:b w:val="0"/>
-        </w:rPr>
-        <w:t>, 전용 던전 2종 각 5단계다.</w:t>
+        <w:t>판매 검증의 중심은 30일 시즌 패스와 일회성 성장 펀드다. 무료 진행을 바탕으로 확정 보상과 성장 선택의 가치를 판매한다. 첫 3지역 33구간 이후에는 테마를 순환하며 무한 진행한다. 전용 던전은 2종, 각 5단계다.</w:t>
       </w:r>
     </w:p>
     <w:p>
@@ -1752,6 +1725,24 @@
         <w:t>진도 부족은 새 적·보스 추가로, 성장 편차는 재화 수급·소모 조정으로 대응한다. 자동 전투의 선택감은 직업별 역할이 드러나는 적 구성으로 검증한다.</w:t>
       </w:r>
     </w:p>
+    <w:p>
+      <w:pPr>
+        <w:pStyle w:val="Heading1"/>
+      </w:pPr>
+      <w:r>
+        <w:t>2026년 9월 운영 개정</w:t>
+      </w:r>
+    </w:p>
+    <w:p>
+      <w:r>
+        <w:t>초반 세 지역 이후에도 장 번호와 난도가 증가하는 순환 진행, 장비 분해·강화석 성장·자동 분해, 육성 메뉴의 루비 영구 성장 탭을 반영한다. 전직별 피격과 보스 접근을 정비하고 구매 에셋과 Comfy 공정을 조합해 마탑 시각 품질을 개선한다. 출시·매출 성과를 의미하는 변경은 아니다.</w:t>
+      </w:r>
+    </w:p>
+    <w:p>
+      <w:r>
+        <w:t>환생은 골드와 일시 골드 강화를 초기화하는 전통적 구조를 준비한다. 영구 보상의 구체적 유형과 경제 곡선은 사용자 문답으로 확정하며 실제 계정 초기화를 미리 적용하지 않는다.</w:t>
+      </w:r>
+    </w:p>
     <w:sectPr>
       <w:footerReference w:type="default" r:id="rId9"/>
       <w:pgSz w:w="11906" w:h="16838"/>

</xml_diff>